<commit_message>
Finalização (revisão do projeto)
</commit_message>
<xml_diff>
--- a/documentação/TCC_DOC.docx
+++ b/documentação/TCC_DOC.docx
@@ -785,9 +785,9 @@
         <w:t>2025</w:t>
       </w:r>
     </w:p>
-    <w:bookmarkStart w:id="1" w:name="_Toc193574439" w:displacedByCustomXml="next"/>
+    <w:bookmarkStart w:id="1" w:name="_Toc194871894" w:displacedByCustomXml="next"/>
     <w:bookmarkStart w:id="2" w:name="_Toc194871776" w:displacedByCustomXml="next"/>
-    <w:bookmarkStart w:id="3" w:name="_Toc194871894" w:displacedByCustomXml="next"/>
+    <w:bookmarkStart w:id="3" w:name="_Toc193574439" w:displacedByCustomXml="next"/>
     <w:sdt>
       <w:sdtPr>
         <w:rPr>
@@ -2241,10 +2241,10 @@
           <w:szCs w:val="24"/>
         </w:rPr>
       </w:pPr>
-      <w:bookmarkStart w:id="4" w:name="_Toc152437024"/>
-      <w:bookmarkStart w:id="5" w:name="_Toc195478876"/>
-      <w:bookmarkStart w:id="6" w:name="_Toc194921628"/>
-      <w:bookmarkStart w:id="7" w:name="_Toc200319268"/>
+      <w:bookmarkStart w:id="4" w:name="_Toc194921628"/>
+      <w:bookmarkStart w:id="5" w:name="_Toc200319268"/>
+      <w:bookmarkStart w:id="6" w:name="_Toc152437024"/>
+      <w:bookmarkStart w:id="7" w:name="_Toc195478876"/>
       <w:bookmarkEnd w:id="3"/>
       <w:bookmarkEnd w:id="2"/>
       <w:bookmarkEnd w:id="1"/>
@@ -2254,8 +2254,8 @@
         </w:rPr>
         <w:t>INTRODUÇÃO</w:t>
       </w:r>
-      <w:bookmarkEnd w:id="6"/>
-      <w:bookmarkEnd w:id="7"/>
+      <w:bookmarkEnd w:id="4"/>
+      <w:bookmarkEnd w:id="5"/>
     </w:p>
     <w:p>
       <w:pPr>
@@ -2270,12 +2270,28 @@
         <w:ind w:firstLine="708"/>
       </w:pPr>
       <w:r>
-        <w:t>O mercado mudou muito nas últimas décadas e junto com essa transformação, a maneira como interagimos com informações também mudou. Empresas e usuários querem algo além de uma plataforma estática, e esperam um sistema inteligente que entenda suas preferências e entregue conteúdos e serviços sob medida. Segundo a Liferay, uma das principais referências no assunto, os portais modernos não são apenas repositórios de dados, mas ferramentas capazes de captar o comportamento dos usuários e adaptar a experiência para torná-la mais relevante e envolvente. Isso significa que, em vez de um espaço genérico, cada pessoa vê informações e funcionalidades ajustadas às suas necessidades, como por exemplo, gerenciar projetos escolares feitos por alunos.</w:t>
-      </w:r>
-    </w:p>
-    <w:p>
-      <w:r>
-        <w:t xml:space="preserve">. Segurança e privacidade também são preocupações centrais no desenvolvimento desses portais. Com o aumento das ameaças digitais e as leis de proteção de dados se tornando mais rigorosas, garantir que as informações estejam seguras virou uma prioridade. A Liferay ressalta que um portal eficiente precisa ter recursos de segurança robustos, evitando vazamentos e acessos não autorizados. Isso fortalece a confiança entre usuários e empresas, algo essencial num mundo onde nossos dados pessoais estão cada vez mais expostos.  </w:t>
+        <w:t xml:space="preserve">O mercado mudou muito nas últimas décadas e junto com essa transformação, a maneira como interagimos com informações também mudou. Empresas e usuários querem algo além de uma plataforma estática, e esperam um sistema inteligente que entenda suas preferências e entregue conteúdos e serviços sob medida. Segundo a </w:t>
+      </w:r>
+      <w:proofErr w:type="spellStart"/>
+      <w:r>
+        <w:t>Liferay</w:t>
+      </w:r>
+      <w:proofErr w:type="spellEnd"/>
+      <w:r>
+        <w:t>, uma das principais referências no assunto, os portais modernos não são apenas repositórios de dados, mas ferramentas capazes de captar o comportamento dos usuários e adaptar a experiência para torná-la mais relevante e envolvente. Isso significa que, em vez de um espaço genérico, cada pessoa vê informações e funcionalidades ajustadas às suas necessidades, como por exemplo, gerenciar projetos escolares feitos por alunos.</w:t>
+      </w:r>
+    </w:p>
+    <w:p>
+      <w:r>
+        <w:t xml:space="preserve">. Segurança e privacidade também são preocupações centrais no desenvolvimento desses portais. Com o aumento das ameaças digitais e as leis de proteção de dados se tornando mais rigorosas, garantir que as informações estejam seguras virou uma prioridade. A </w:t>
+      </w:r>
+      <w:proofErr w:type="spellStart"/>
+      <w:r>
+        <w:t>Liferay</w:t>
+      </w:r>
+      <w:proofErr w:type="spellEnd"/>
+      <w:r>
+        <w:t xml:space="preserve"> ressalta que um portal eficiente precisa ter recursos de segurança robustos, evitando vazamentos e acessos não autorizados. Isso fortalece a confiança entre usuários e empresas, algo essencial num mundo onde nossos dados pessoais estão cada vez mais expostos.  </w:t>
       </w:r>
     </w:p>
     <w:p>
@@ -2287,7 +2303,23 @@
       </w:r>
       <w:r>
         <w:lastRenderedPageBreak/>
-        <w:t xml:space="preserve">interconectada, conhecida como omnichannel, é algo que se tornou praticamente obrigatório. Segundo a Liferay, oferecer essa integração entre diferentes canais melhora a relação entre empresas e clientes, além de tornar a comunicação interna mais ágil e eficiente.  </w:t>
+        <w:t xml:space="preserve">interconectada, conhecida como </w:t>
+      </w:r>
+      <w:proofErr w:type="spellStart"/>
+      <w:r>
+        <w:t>omnichannel</w:t>
+      </w:r>
+      <w:proofErr w:type="spellEnd"/>
+      <w:r>
+        <w:t xml:space="preserve">, é algo que se tornou praticamente obrigatório. Segundo a </w:t>
+      </w:r>
+      <w:proofErr w:type="spellStart"/>
+      <w:r>
+        <w:t>Liferay</w:t>
+      </w:r>
+      <w:proofErr w:type="spellEnd"/>
+      <w:r>
+        <w:t xml:space="preserve">, oferecer essa integração entre diferentes canais melhora a relação entre empresas e clientes, além de tornar a comunicação interna mais ágil e eficiente.  </w:t>
       </w:r>
     </w:p>
     <w:p>
@@ -2375,7 +2407,23 @@
     <w:p>
       <w:r>
         <w:tab/>
-        <w:t>Por fim, plataformas mais voltadas para a comunicação escolar, como o ClassApp, apresentam um modelo mais estruturado para conectar alunos, professores e responsáveis. O ClassApp permite envio de avisos e mensagens personalizadas, sendo utilizado em algumas instituições de ensino para melhorar a comunicação interna. No entanto, trata-se de um serviço pago e voltado principalmente para escolas particulares, o que pode limitar sua implementação na ETEC. Além disso, não é totalmente adaptável às necessidades específicas dos alunos e grupos estudantis.</w:t>
+        <w:t xml:space="preserve">Por fim, plataformas mais voltadas para a comunicação escolar, como o </w:t>
+      </w:r>
+      <w:proofErr w:type="spellStart"/>
+      <w:r>
+        <w:t>ClassApp</w:t>
+      </w:r>
+      <w:proofErr w:type="spellEnd"/>
+      <w:r>
+        <w:t xml:space="preserve">, apresentam um modelo mais estruturado para conectar alunos, professores e responsáveis. O </w:t>
+      </w:r>
+      <w:proofErr w:type="spellStart"/>
+      <w:r>
+        <w:t>ClassApp</w:t>
+      </w:r>
+      <w:proofErr w:type="spellEnd"/>
+      <w:r>
+        <w:t xml:space="preserve"> permite envio de avisos e mensagens personalizadas, sendo utilizado em algumas instituições de ensino para melhorar a comunicação interna. No entanto, trata-se de um serviço pago e voltado principalmente para escolas particulares, o que pode limitar sua implementação na ETEC. Além disso, não é totalmente adaptável às necessidades específicas dos alunos e grupos estudantis.</w:t>
       </w:r>
     </w:p>
     <w:p>
@@ -2419,7 +2467,23 @@
         <w:ind w:firstLine="694"/>
       </w:pPr>
       <w:r>
-        <w:t>Os Sistemas de Gestão de Aprendizagem (LMS) têm se mostrado essenciais no setor educacional e também nas empresas. Plataformas como Moodle, Blackboard e Google Classroom integram a gestão de conteúdo educacional, acompanhamento do progresso dos alunos e avaliação de desempenho em um único ambiente digital. Esses sistemas oferecem uma abordagem colaborativa e interativa no processo de aprendizagem. Isso não só facilita a gestão de cursos, mas também melhora a experiência de aprendizagem, criando um ambiente dinâmico. Segundo Cruz e Oliveira (2020), "os LMS não apenas centralizam informações, mas também possibilitam a personalização do ensino, ajustando o conteúdo ao ritmo e estilo de aprendizagem do aluno" (CRUZ; OLIVEIRA, 2020, p. 156).</w:t>
+        <w:t xml:space="preserve">Os Sistemas de Gestão de Aprendizagem (LMS) têm se mostrado essenciais no setor educacional e também nas empresas. Plataformas como Moodle, </w:t>
+      </w:r>
+      <w:proofErr w:type="spellStart"/>
+      <w:r>
+        <w:t>Blackboard</w:t>
+      </w:r>
+      <w:proofErr w:type="spellEnd"/>
+      <w:r>
+        <w:t xml:space="preserve"> e Google </w:t>
+      </w:r>
+      <w:proofErr w:type="spellStart"/>
+      <w:r>
+        <w:t>Classroom</w:t>
+      </w:r>
+      <w:proofErr w:type="spellEnd"/>
+      <w:r>
+        <w:t xml:space="preserve"> integram a gestão de conteúdo educacional, acompanhamento do progresso dos alunos e avaliação de desempenho em um único ambiente digital. Esses sistemas oferecem uma abordagem colaborativa e interativa no processo de aprendizagem. Isso não só facilita a gestão de cursos, mas também melhora a experiência de aprendizagem, criando um ambiente dinâmico. Segundo Cruz e Oliveira (2020), "os LMS não apenas centralizam informações, mas também possibilitam a personalização do ensino, ajustando o conteúdo ao ritmo e estilo de aprendizagem do aluno" (CRUZ; OLIVEIRA, 2020, p. 156).</w:t>
       </w:r>
     </w:p>
     <w:p>
@@ -2460,7 +2524,15 @@
         <w:ind w:firstLine="360"/>
       </w:pPr>
       <w:r>
-        <w:t xml:space="preserve">Nossa oportunidade é a possibilidade de expansão, não se limitando apenas às ETECs, mas também podendo ser implementado em outras instituições de ensino. Há também a chance de parcerias com empresas, permitindo que o portal seja utilizado para a divulgação de estágios ou outras oportunidades. A plataforma pode ser </w:t>
+        <w:t xml:space="preserve">Nossa oportunidade é a possibilidade de expansão, não se limitando apenas às </w:t>
+      </w:r>
+      <w:proofErr w:type="spellStart"/>
+      <w:r>
+        <w:t>ETECs</w:t>
+      </w:r>
+      <w:proofErr w:type="spellEnd"/>
+      <w:r>
+        <w:t xml:space="preserve">, mas também podendo ser implementado em outras instituições de ensino. Há também a chance de parcerias com empresas, permitindo que o portal seja utilizado para a divulgação de estágios ou outras oportunidades. A plataforma pode ser </w:t>
       </w:r>
       <w:r>
         <w:lastRenderedPageBreak/>
@@ -2532,7 +2604,15 @@
       </w:r>
       <w:r>
         <w:lastRenderedPageBreak/>
-        <w:t>rápidas nas preferências dos usuários e na evolução tecnológica. "O setor de portais de comunicação está em constante transformação, com novas soluções e integrações sendo desenvolvidas para atender às demandas de um público mais exigente e conectado" destaca Rocha (2020, p. 120). A renovação dos portais implica em incorporar novos elementos, como chatbots, automação de processos e personalização por meio de análise de dados, criando uma experiência ainda mais fluida e eficaz.</w:t>
+        <w:t xml:space="preserve">rápidas nas preferências dos usuários e na evolução tecnológica. "O setor de portais de comunicação está em constante transformação, com novas soluções e integrações sendo desenvolvidas para atender às demandas de um público mais exigente e conectado" destaca Rocha (2020, p. 120). A renovação dos portais implica em incorporar novos elementos, como </w:t>
+      </w:r>
+      <w:proofErr w:type="spellStart"/>
+      <w:r>
+        <w:t>chatbots</w:t>
+      </w:r>
+      <w:proofErr w:type="spellEnd"/>
+      <w:r>
+        <w:t>, automação de processos e personalização por meio de análise de dados, criando uma experiência ainda mais fluida e eficaz.</w:t>
       </w:r>
     </w:p>
     <w:p>
@@ -2570,6 +2650,8 @@
       <w:pPr>
         <w:pStyle w:val="Ttulo2"/>
         <w:rPr>
+          <w:b w:val="0"/>
+          <w:bCs/>
           <w:sz w:val="28"/>
           <w:szCs w:val="28"/>
         </w:rPr>
@@ -2580,14 +2662,26 @@
       <w:bookmarkStart w:id="14" w:name="_Toc200319269"/>
       <w:r>
         <w:rPr>
+          <w:b w:val="0"/>
+          <w:bCs/>
+          <w:szCs w:val="24"/>
+        </w:rPr>
+        <w:lastRenderedPageBreak/>
+        <w:t>1.1</w:t>
+      </w:r>
+      <w:r>
+        <w:rPr>
+          <w:b w:val="0"/>
+          <w:bCs/>
           <w:sz w:val="28"/>
           <w:szCs w:val="28"/>
         </w:rPr>
-        <w:lastRenderedPageBreak/>
-        <w:t xml:space="preserve">1.1 </w:t>
-      </w:r>
-      <w:r>
-        <w:rPr>
+        <w:t xml:space="preserve"> </w:t>
+      </w:r>
+      <w:r>
+        <w:rPr>
+          <w:b w:val="0"/>
+          <w:bCs/>
           <w:szCs w:val="24"/>
         </w:rPr>
         <w:t>Problema</w:t>
@@ -2598,6 +2692,8 @@
       <w:bookmarkEnd w:id="14"/>
       <w:r>
         <w:rPr>
+          <w:b w:val="0"/>
+          <w:bCs/>
           <w:szCs w:val="24"/>
         </w:rPr>
         <w:t xml:space="preserve"> </w:t>
@@ -2657,17 +2753,11 @@
       <w:bookmarkStart w:id="18" w:name="_Toc200319270"/>
       <w:r>
         <w:rPr>
-          <w:sz w:val="28"/>
-          <w:szCs w:val="28"/>
-        </w:rPr>
-        <w:t xml:space="preserve">1.2 </w:t>
-      </w:r>
-      <w:r>
-        <w:rPr>
-          <w:sz w:val="28"/>
-          <w:szCs w:val="28"/>
-        </w:rPr>
-        <w:t>Justificativa</w:t>
+          <w:b w:val="0"/>
+          <w:bCs/>
+          <w:szCs w:val="24"/>
+        </w:rPr>
+        <w:t>1.2 Justificativa</w:t>
       </w:r>
       <w:bookmarkEnd w:id="15"/>
       <w:bookmarkEnd w:id="16"/>
@@ -2698,20 +2788,41 @@
       </w:pPr>
       <w:r>
         <w:tab/>
-        <w:t xml:space="preserve">Sob essa ótica, o projeto E-portal traz um site de notícias e comunicação interativa, capaz de suprir as necessidades de instituições de ensino que se encontram desatualizadas no âmbito da comunicação, junto de uma estética agradável e intuitiva, o tal possui um sistema de permissões que possibilita o login de docentes e discentes com permissões diferentes, onde um gerencia e publica as notícias, enquanto o outro visualiza e reage, respectivamente. Ademais, o site conta com um sistema de inscrição mais prática nos projetos extracurriculares, coisa que não é muito popular em outros sites e sistemas concorrentes, os ”Projetos extracurriculares estimulam a criatividade, a autonomia e o trabalho em equipe, </w:t>
-      </w:r>
+        <w:t xml:space="preserve">Sob essa ótica, o projeto E-portal traz um site de notícias e comunicação interativa, capaz de suprir as necessidades de instituições de ensino que se encontram desatualizadas no âmbito da comunicação, junto de uma estética agradável e intuitiva, o tal possui um sistema de permissões que possibilita o login de docentes e discentes com permissões diferentes, onde um gerencia e publica as notícias, enquanto o outro visualiza e reage, respectivamente. Ademais, o site conta com um sistema de inscrição mais prática nos projetos extracurriculares, coisa que não é muito popular em outros sites e sistemas concorrentes, </w:t>
+      </w:r>
+      <w:proofErr w:type="gramStart"/>
+      <w:r>
+        <w:t>os ”Projetos</w:t>
+      </w:r>
+      <w:proofErr w:type="gramEnd"/>
+      <w:r>
+        <w:t xml:space="preserve"> extracurriculares estimulam a criatividade, a autonomia e o trabalho em equipe, preparando os estudantes para desafios reais.”, segundo a educadora italiana, Maria Montessori, portanto são de suma importância para os alunos.</w:t>
+      </w:r>
+    </w:p>
+    <w:p>
+      <w:pPr>
+        <w:spacing w:after="120"/>
+        <w:ind w:left="10" w:firstLine="698"/>
+      </w:pPr>
       <w:r>
         <w:lastRenderedPageBreak/>
-        <w:t>preparando os estudantes para desafios reais.”, segundo a educadora italiana, Maria Montessori, portanto são de suma importância para os alunos.</w:t>
-      </w:r>
-    </w:p>
-    <w:p>
-      <w:pPr>
-        <w:spacing w:after="120"/>
-        <w:ind w:left="10" w:firstLine="698"/>
-      </w:pPr>
-      <w:r>
-        <w:t>Ao observar a comunicação na área educacional, torna-se vísivel a necessidade de um aprimoramento, o projeto E-portal, planeja suprir tal necessidade através de um site de notícias, que organizado pela coordenação disponibiliza fatos e eventos aos alunos que visualizam de maneira prática e simples, simplificando a comunicação na vida cotidiana escolar, e dessa maneira auxiliar no desenvolvimento dos alunos, como disse o pedagogo neozelandês John Hattie:”A qualidade da comunicação em sala de aula influencia diretamente o envolvimento e a motivação dos alunos.”, desse modo o objetivo do projeto é auxiliar no desenvolvimento da comunicação de instituições de ensino.</w:t>
+        <w:t xml:space="preserve">Ao observar a comunicação na área educacional, torna-se </w:t>
+      </w:r>
+      <w:proofErr w:type="spellStart"/>
+      <w:r>
+        <w:t>vísivel</w:t>
+      </w:r>
+      <w:proofErr w:type="spellEnd"/>
+      <w:r>
+        <w:t xml:space="preserve"> a necessidade de um aprimoramento, o projeto E-portal, planeja suprir tal necessidade através de um site de notícias, que organizado pela coordenação disponibiliza fatos e eventos aos alunos que visualizam de maneira prática e simples, simplificando a comunicação na vida cotidiana escolar, e dessa maneira auxiliar no desenvolvimento dos alunos, como disse o pedagogo neozelandês John </w:t>
+      </w:r>
+      <w:proofErr w:type="spellStart"/>
+      <w:r>
+        <w:t>Hattie</w:t>
+      </w:r>
+      <w:proofErr w:type="spellEnd"/>
+      <w:r>
+        <w:t>:”A qualidade da comunicação em sala de aula influencia diretamente o envolvimento e a motivação dos alunos.”, desse modo o objetivo do projeto é auxiliar no desenvolvimento da comunicação de instituições de ensino.</w:t>
       </w:r>
     </w:p>
     <w:p>
@@ -2721,7 +2832,15 @@
       </w:pPr>
       <w:r>
         <w:tab/>
-        <w:t>Logo, dado o exposto, a serventia do projeto apresentado é suprir as necessidades de uma comunicação atualizada e eficiente entre alunos e coordenação, sendo estes o público-alvo do projeto, visto que são os principais usuários de uma troca de informações tanto dentro, quanto fora do recinto escolar que muitas vezes não é efetiva, as ferramentas digitais são mais adequadas para o avanço da comunicação nas redes de ensino, assim como cria o escritor norte-americano, Howard Rheingold, “A modernização da comunicação na educação não é um luxo, mas um requisito para engajar uma geração que nasceu conectada.”..</w:t>
+        <w:t xml:space="preserve">Logo, dado o exposto, a serventia do projeto apresentado é suprir as necessidades de uma comunicação atualizada e eficiente entre alunos e coordenação, sendo estes o público-alvo do projeto, visto que são os principais usuários de uma troca de informações tanto dentro, quanto fora do recinto escolar que muitas vezes não é efetiva, as ferramentas digitais são mais adequadas para o avanço da comunicação nas redes de ensino, assim como cria o escritor norte-americano, Howard </w:t>
+      </w:r>
+      <w:proofErr w:type="spellStart"/>
+      <w:r>
+        <w:t>Rheingold</w:t>
+      </w:r>
+      <w:proofErr w:type="spellEnd"/>
+      <w:r>
+        <w:t>, “A modernização da comunicação na educação não é um luxo, mas um requisito para engajar uma geração que nasceu conectada.”..</w:t>
       </w:r>
     </w:p>
     <w:p>
@@ -2731,7 +2850,15 @@
       </w:pPr>
       <w:r>
         <w:tab/>
-        <w:t>O E-Portal tem como público-alvo principal os alunos da ETEC de Poá, além de integrantes do Grêmio Estudantil, Atlética, professores e demais setores administrativos da escola. O sistema foi idealizado para atender às necessidades desses grupos, facilitando a comunicação e garantindo que informações importantes sejam acessadas de maneira rápida e organizada.</w:t>
+        <w:t xml:space="preserve">O E-Portal tem como público-alvo principal os alunos da ETEC de Poá, além de integrantes do Grêmio Estudantil, </w:t>
+      </w:r>
+      <w:proofErr w:type="gramStart"/>
+      <w:r>
+        <w:t>Atlética</w:t>
+      </w:r>
+      <w:proofErr w:type="gramEnd"/>
+      <w:r>
+        <w:t>, professores e demais setores administrativos da escola. O sistema foi idealizado para atender às necessidades desses grupos, facilitando a comunicação e garantindo que informações importantes sejam acessadas de maneira rápida e organizada.</w:t>
       </w:r>
     </w:p>
     <w:p>
@@ -2750,11 +2877,11 @@
       </w:pPr>
       <w:r>
         <w:tab/>
-        <w:t xml:space="preserve">Os usuários utilizarão o E-Portal porque ele oferecerá uma plataforma centralizada e acessível, onde será possível acompanhar todas as atualizações </w:t>
+        <w:t xml:space="preserve">Os usuários utilizarão o E-Portal porque ele oferecerá uma plataforma centralizada e acessível, onde será possível acompanhar todas as atualizações relevantes da escola em um único lugar. O sistema tornará mais prático o processo de inscrição em projetos, a divulgação de vagas na Atlética ou no Grêmio, além de permitir que os estudantes fiquem informados sobre eventos e atividades acadêmicas. </w:t>
       </w:r>
       <w:r>
         <w:lastRenderedPageBreak/>
-        <w:t>relevantes da escola em um único lugar. O sistema tornará mais prático o processo de inscrição em projetos, a divulgação de vagas na Atlética ou no Grêmio, além de permitir que os estudantes fiquem informados sobre eventos e atividades acadêmicas. Dessa forma, o portal aumentará o engajamento dos alunos, fortalecerá a organização das entidades estudantis e facilitará a disseminação de informações dentro da ETEC.</w:t>
+        <w:t>Dessa forma, o portal aumentará o engajamento dos alunos, fortalecerá a organização das entidades estudantis e facilitará a disseminação de informações dentro da ETEC.</w:t>
       </w:r>
     </w:p>
     <w:p>
@@ -2767,6 +2894,8 @@
       <w:pPr>
         <w:pStyle w:val="Ttulo2"/>
         <w:rPr>
+          <w:b w:val="0"/>
+          <w:bCs/>
           <w:szCs w:val="24"/>
         </w:rPr>
       </w:pPr>
@@ -2776,6 +2905,8 @@
       <w:bookmarkStart w:id="22" w:name="_Toc200319271"/>
       <w:r>
         <w:rPr>
+          <w:b w:val="0"/>
+          <w:bCs/>
           <w:szCs w:val="24"/>
         </w:rPr>
         <w:t>1.3 Objetivo Geral</w:t>
@@ -2795,6 +2926,8 @@
       <w:pPr>
         <w:pStyle w:val="Ttulo2"/>
         <w:rPr>
+          <w:b w:val="0"/>
+          <w:bCs/>
           <w:szCs w:val="24"/>
         </w:rPr>
       </w:pPr>
@@ -2804,6 +2937,8 @@
       <w:bookmarkStart w:id="26" w:name="_Toc200319272"/>
       <w:r>
         <w:rPr>
+          <w:b w:val="0"/>
+          <w:bCs/>
           <w:szCs w:val="24"/>
         </w:rPr>
         <w:t>1.4 Objetivos Específicos</w:t>
@@ -2880,6 +3015,8 @@
       <w:pPr>
         <w:pStyle w:val="Ttulo2"/>
         <w:rPr>
+          <w:b w:val="0"/>
+          <w:bCs/>
           <w:szCs w:val="24"/>
         </w:rPr>
       </w:pPr>
@@ -2889,6 +3026,8 @@
       <w:bookmarkStart w:id="30" w:name="_Toc200319273"/>
       <w:r>
         <w:rPr>
+          <w:b w:val="0"/>
+          <w:bCs/>
           <w:szCs w:val="24"/>
         </w:rPr>
         <w:t>1.5 Hipóteses</w:t>
@@ -2927,7 +3066,7 @@
         </w:rPr>
         <w:t xml:space="preserve">2. </w:t>
       </w:r>
-      <w:bookmarkEnd w:id="4"/>
+      <w:bookmarkEnd w:id="6"/>
       <w:r>
         <w:rPr>
           <w:rFonts w:cs="Arial"/>
@@ -2935,7 +3074,7 @@
         </w:rPr>
         <w:t>METODOLOGIA</w:t>
       </w:r>
-      <w:bookmarkEnd w:id="5"/>
+      <w:bookmarkEnd w:id="7"/>
       <w:bookmarkEnd w:id="31"/>
     </w:p>
     <w:p>
@@ -2960,6 +3099,8 @@
         <w:pStyle w:val="Ttulo2"/>
         <w:rPr>
           <w:rFonts w:cs="Arial"/>
+          <w:b w:val="0"/>
+          <w:bCs/>
           <w:szCs w:val="24"/>
         </w:rPr>
       </w:pPr>
@@ -2968,13 +3109,26 @@
       <w:r>
         <w:rPr>
           <w:rFonts w:cs="Arial"/>
+          <w:b w:val="0"/>
+          <w:bCs/>
           <w:szCs w:val="24"/>
         </w:rPr>
         <w:lastRenderedPageBreak/>
-        <w:t>2.1 Canvas</w:t>
+        <w:t xml:space="preserve">2.1 </w:t>
+      </w:r>
+      <w:proofErr w:type="spellStart"/>
+      <w:r>
+        <w:rPr>
+          <w:rFonts w:cs="Arial"/>
+          <w:b w:val="0"/>
+          <w:bCs/>
+          <w:szCs w:val="24"/>
+        </w:rPr>
+        <w:t>Canvas</w:t>
       </w:r>
       <w:bookmarkEnd w:id="32"/>
       <w:bookmarkEnd w:id="33"/>
+      <w:proofErr w:type="spellEnd"/>
     </w:p>
     <w:p>
       <w:pPr>
@@ -3059,6 +3213,8 @@
         <w:spacing w:before="0" w:after="120"/>
         <w:rPr>
           <w:rFonts w:cs="Arial"/>
+          <w:b w:val="0"/>
+          <w:bCs/>
           <w:szCs w:val="24"/>
         </w:rPr>
       </w:pPr>
@@ -3067,6 +3223,8 @@
       <w:r>
         <w:rPr>
           <w:rFonts w:cs="Arial"/>
+          <w:b w:val="0"/>
+          <w:bCs/>
           <w:szCs w:val="24"/>
         </w:rPr>
         <w:t>2.2 Requisitos</w:t>
@@ -3096,6 +3254,8 @@
         <w:pStyle w:val="Ttulo2"/>
         <w:rPr>
           <w:rFonts w:cs="Arial"/>
+          <w:b w:val="0"/>
+          <w:bCs/>
           <w:szCs w:val="24"/>
         </w:rPr>
       </w:pPr>
@@ -3104,6 +3264,8 @@
       <w:r>
         <w:rPr>
           <w:rFonts w:cs="Arial"/>
+          <w:b w:val="0"/>
+          <w:bCs/>
           <w:szCs w:val="24"/>
         </w:rPr>
         <w:t>2.2.1 Requisitos Funcionais</w:t>
@@ -3468,7 +3630,23 @@
                 <w:rFonts w:cs="Arial"/>
                 <w:szCs w:val="24"/>
               </w:rPr>
-              <w:t>Permite o usuário realizar  inscrições em projetos da escola.</w:t>
+              <w:t xml:space="preserve">Permite o usuário </w:t>
+            </w:r>
+            <w:proofErr w:type="gramStart"/>
+            <w:r>
+              <w:rPr>
+                <w:rFonts w:cs="Arial"/>
+                <w:szCs w:val="24"/>
+              </w:rPr>
+              <w:t>realizar  inscrições</w:t>
+            </w:r>
+            <w:proofErr w:type="gramEnd"/>
+            <w:r>
+              <w:rPr>
+                <w:rFonts w:cs="Arial"/>
+                <w:szCs w:val="24"/>
+              </w:rPr>
+              <w:t xml:space="preserve"> em projetos da escola.</w:t>
             </w:r>
           </w:p>
         </w:tc>
@@ -3517,7 +3695,23 @@
                 <w:rFonts w:cs="Arial"/>
                 <w:szCs w:val="24"/>
               </w:rPr>
-              <w:t>Realiza o gerenciamento das inscrições dos projetos ,informações novidades e eventos.</w:t>
+              <w:t xml:space="preserve">Realiza o gerenciamento das inscrições dos </w:t>
+            </w:r>
+            <w:proofErr w:type="gramStart"/>
+            <w:r>
+              <w:rPr>
+                <w:rFonts w:cs="Arial"/>
+                <w:szCs w:val="24"/>
+              </w:rPr>
+              <w:t>projetos ,informações</w:t>
+            </w:r>
+            <w:proofErr w:type="gramEnd"/>
+            <w:r>
+              <w:rPr>
+                <w:rFonts w:cs="Arial"/>
+                <w:szCs w:val="24"/>
+              </w:rPr>
+              <w:t xml:space="preserve"> novidades e eventos.</w:t>
             </w:r>
           </w:p>
         </w:tc>
@@ -3774,10 +3968,19 @@
           <w:rFonts w:cs="Arial"/>
           <w:szCs w:val="24"/>
         </w:rPr>
-        <w:t>2.2.2 Requisitos não Funcionais</w:t>
+        <w:t xml:space="preserve">2.2.2 Requisitos </w:t>
+      </w:r>
+      <w:proofErr w:type="gramStart"/>
+      <w:r>
+        <w:rPr>
+          <w:rFonts w:cs="Arial"/>
+          <w:szCs w:val="24"/>
+        </w:rPr>
+        <w:t>não Funcionais</w:t>
       </w:r>
       <w:bookmarkEnd w:id="38"/>
       <w:bookmarkEnd w:id="39"/>
+      <w:proofErr w:type="gramEnd"/>
     </w:p>
     <w:p>
       <w:pPr>
@@ -4398,12 +4601,21 @@
           <w:szCs w:val="24"/>
         </w:rPr>
       </w:pPr>
-      <w:r>
-        <w:rPr>
-          <w:rFonts w:cs="Arial"/>
-          <w:szCs w:val="24"/>
-        </w:rPr>
-        <w:t>Brainstoming; Observação direta; Diagrama de classe; Diagrama de caso de uso; Prototipagem de baixa fidelidade.</w:t>
+      <w:proofErr w:type="spellStart"/>
+      <w:r>
+        <w:rPr>
+          <w:rFonts w:cs="Arial"/>
+          <w:szCs w:val="24"/>
+        </w:rPr>
+        <w:t>Brainstoming</w:t>
+      </w:r>
+      <w:proofErr w:type="spellEnd"/>
+      <w:r>
+        <w:rPr>
+          <w:rFonts w:cs="Arial"/>
+          <w:szCs w:val="24"/>
+        </w:rPr>
+        <w:t>; Observação direta; Diagrama de classe; Diagrama de caso de uso; Prototipagem de baixa fidelidade.</w:t>
       </w:r>
     </w:p>
     <w:p>
@@ -4442,6 +4654,8 @@
         <w:pStyle w:val="Ttulo2"/>
         <w:rPr>
           <w:rFonts w:cs="Arial"/>
+          <w:b w:val="0"/>
+          <w:bCs/>
           <w:szCs w:val="24"/>
         </w:rPr>
       </w:pPr>
@@ -4450,6 +4664,8 @@
       <w:r>
         <w:rPr>
           <w:rFonts w:cs="Arial"/>
+          <w:b w:val="0"/>
+          <w:bCs/>
           <w:szCs w:val="24"/>
         </w:rPr>
         <w:t>2.3.1.1 Questões da entrevista</w:t>
@@ -4652,6 +4868,8 @@
         <w:pStyle w:val="Ttulo2"/>
         <w:rPr>
           <w:rFonts w:cs="Arial"/>
+          <w:b w:val="0"/>
+          <w:bCs/>
           <w:szCs w:val="24"/>
         </w:rPr>
       </w:pPr>
@@ -4659,6 +4877,8 @@
       <w:r>
         <w:rPr>
           <w:rFonts w:cs="Arial"/>
+          <w:b w:val="0"/>
+          <w:bCs/>
           <w:szCs w:val="24"/>
         </w:rPr>
         <w:lastRenderedPageBreak/>
@@ -4859,6 +5079,8 @@
         <w:pStyle w:val="Ttulo2"/>
         <w:rPr>
           <w:rFonts w:cs="Arial"/>
+          <w:b w:val="0"/>
+          <w:bCs/>
           <w:szCs w:val="24"/>
         </w:rPr>
       </w:pPr>
@@ -4866,6 +5088,8 @@
       <w:r>
         <w:rPr>
           <w:rFonts w:cs="Arial"/>
+          <w:b w:val="0"/>
+          <w:bCs/>
           <w:szCs w:val="24"/>
         </w:rPr>
         <w:lastRenderedPageBreak/>
@@ -4889,7 +5113,61 @@
           <w:szCs w:val="24"/>
           <w:lang w:eastAsia="pt-BR"/>
         </w:rPr>
-        <w:t>O Kanban é uma metodologia ágil voltada para a gestão visual de tarefas e fluxos de trabalho. Criado originalmente pela Toyota, no Japão, na década de 1940, para otimizar os processos de produção industrial, o método foi posteriormente adaptado para outras áreas, como o desenvolvimento de software e o gerenciamento de projetos em geral. A palavra "Kanban" significa "cartão" ou "sinal visual" em japonês, refletindo seu principal objetivo: tornar o trabalho visível. A estrutura básica do Kanban consiste em um quadro dividido em colunas que representam as etapas do processo (como "A Fazer", "Em Andamento" e "Concluído"), nas quais são distribuídos cartões que simbolizam as tarefas a serem realizadas. À medida que o trabalho avança, esses cartões são movidos de uma coluna para outra, permitindo que todos os envolvidos acompanhem o progresso das atividades de forma clara e objetiva.</w:t>
+        <w:t xml:space="preserve">O </w:t>
+      </w:r>
+      <w:proofErr w:type="spellStart"/>
+      <w:r>
+        <w:rPr>
+          <w:rFonts w:eastAsia="Times New Roman" w:cs="Arial"/>
+          <w:szCs w:val="24"/>
+          <w:lang w:eastAsia="pt-BR"/>
+        </w:rPr>
+        <w:t>Kanban</w:t>
+      </w:r>
+      <w:proofErr w:type="spellEnd"/>
+      <w:r>
+        <w:rPr>
+          <w:rFonts w:eastAsia="Times New Roman" w:cs="Arial"/>
+          <w:szCs w:val="24"/>
+          <w:lang w:eastAsia="pt-BR"/>
+        </w:rPr>
+        <w:t xml:space="preserve"> é uma metodologia ágil voltada para a gestão visual de tarefas e fluxos de trabalho. Criado originalmente pela Toyota, no Japão, na década de 1940, para otimizar os processos de produção industrial, o método foi posteriormente adaptado para outras áreas, como o desenvolvimento de software e o gerenciamento de projetos em geral. A palavra "</w:t>
+      </w:r>
+      <w:proofErr w:type="spellStart"/>
+      <w:r>
+        <w:rPr>
+          <w:rFonts w:eastAsia="Times New Roman" w:cs="Arial"/>
+          <w:szCs w:val="24"/>
+          <w:lang w:eastAsia="pt-BR"/>
+        </w:rPr>
+        <w:t>Kanban</w:t>
+      </w:r>
+      <w:proofErr w:type="spellEnd"/>
+      <w:r>
+        <w:rPr>
+          <w:rFonts w:eastAsia="Times New Roman" w:cs="Arial"/>
+          <w:szCs w:val="24"/>
+          <w:lang w:eastAsia="pt-BR"/>
+        </w:rPr>
+        <w:t xml:space="preserve">" significa "cartão" ou "sinal visual" em japonês, refletindo seu principal objetivo: tornar o trabalho visível. A estrutura básica do </w:t>
+      </w:r>
+      <w:proofErr w:type="spellStart"/>
+      <w:r>
+        <w:rPr>
+          <w:rFonts w:eastAsia="Times New Roman" w:cs="Arial"/>
+          <w:szCs w:val="24"/>
+          <w:lang w:eastAsia="pt-BR"/>
+        </w:rPr>
+        <w:t>Kanban</w:t>
+      </w:r>
+      <w:proofErr w:type="spellEnd"/>
+      <w:r>
+        <w:rPr>
+          <w:rFonts w:eastAsia="Times New Roman" w:cs="Arial"/>
+          <w:szCs w:val="24"/>
+          <w:lang w:eastAsia="pt-BR"/>
+        </w:rPr>
+        <w:t xml:space="preserve"> consiste em um quadro dividido em colunas que representam as etapas do processo (como "A Fazer", "Em Andamento" e "Concluído"), nas quais são distribuídos cartões que simbolizam as tarefas a serem realizadas. À medida que o trabalho avança, esses cartões são movidos de uma coluna para outra, permitindo que todos os envolvidos acompanhem o progresso das atividades de forma clara e objetiva.</w:t>
       </w:r>
     </w:p>
     <w:p>
@@ -4908,14 +5186,32 @@
           <w:szCs w:val="24"/>
           <w:lang w:eastAsia="pt-BR"/>
         </w:rPr>
-        <w:t>A escolha por utilizar o Kanban neste projeto se justifica por diversos fatores. Em primeiro lugar, trata-se de uma ferramenta que promove a organização visual do trab</w:t>
-      </w:r>
+        <w:t xml:space="preserve">A escolha por utilizar o </w:t>
+      </w:r>
+      <w:proofErr w:type="spellStart"/>
       <w:r>
         <w:rPr>
           <w:rFonts w:eastAsia="Times New Roman" w:cs="Arial"/>
           <w:szCs w:val="24"/>
           <w:lang w:eastAsia="pt-BR"/>
         </w:rPr>
+        <w:t>Kanban</w:t>
+      </w:r>
+      <w:proofErr w:type="spellEnd"/>
+      <w:r>
+        <w:rPr>
+          <w:rFonts w:eastAsia="Times New Roman" w:cs="Arial"/>
+          <w:szCs w:val="24"/>
+          <w:lang w:eastAsia="pt-BR"/>
+        </w:rPr>
+        <w:t xml:space="preserve"> neste projeto se justifica por diversos fatores. Em primeiro lugar, trata-se de uma ferramenta que promove a organização visual do trab</w:t>
+      </w:r>
+      <w:r>
+        <w:rPr>
+          <w:rFonts w:eastAsia="Times New Roman" w:cs="Arial"/>
+          <w:szCs w:val="24"/>
+          <w:lang w:eastAsia="pt-BR"/>
+        </w:rPr>
         <w:t>a</w:t>
       </w:r>
       <w:r>
@@ -4924,23 +5220,131 @@
           <w:szCs w:val="24"/>
           <w:lang w:eastAsia="pt-BR"/>
         </w:rPr>
-        <w:t>lho, facilitando o acompanhamento das tarefas, prazos e responsáveis. Além disso, sua implementação é simples e acessível, podendo ser feita por meio de plataformas digitais comoTrello,</w:t>
-      </w:r>
+        <w:t xml:space="preserve">lho, facilitando o acompanhamento das tarefas, prazos e responsáveis. Além disso, sua implementação é simples e acessível, podendo ser feita por meio de plataformas digitais </w:t>
+      </w:r>
+      <w:proofErr w:type="spellStart"/>
       <w:r>
         <w:rPr>
           <w:rFonts w:eastAsia="Times New Roman" w:cs="Arial"/>
           <w:szCs w:val="24"/>
           <w:lang w:eastAsia="pt-BR"/>
         </w:rPr>
-        <w:t xml:space="preserve"> Microsoft Planner,</w:t>
-      </w:r>
+        <w:t>comoTrello</w:t>
+      </w:r>
+      <w:proofErr w:type="spellEnd"/>
       <w:r>
         <w:rPr>
           <w:rFonts w:eastAsia="Times New Roman" w:cs="Arial"/>
           <w:szCs w:val="24"/>
           <w:lang w:eastAsia="pt-BR"/>
         </w:rPr>
-        <w:t xml:space="preserve"> Jira ou GitHub Projects, ou até mesmo com quadros físicos. Outro benefício importante é a melhoria na gestão do tempo, pois o Kanban permite identificar gargalos no processo e redistribuir as atividades de maneira mais eficiente. A visualização constante do progresso contribui também para uma tomada de decisão mais assertiva e um maior controle dos prazos estabelecidos. Por fim, trata-se de uma metodologia flexível, que se adapta facilmente ao ritmo de trabalho da equipe e à complexidade do projeto. Dessa forma, o uso do Kanban tem sido fundamental para garantir uma execução organizada, colaborativa e produtiva do nosso </w:t>
+        <w:t>,</w:t>
+      </w:r>
+      <w:r>
+        <w:rPr>
+          <w:rFonts w:eastAsia="Times New Roman" w:cs="Arial"/>
+          <w:szCs w:val="24"/>
+          <w:lang w:eastAsia="pt-BR"/>
+        </w:rPr>
+        <w:t xml:space="preserve"> Microsoft </w:t>
+      </w:r>
+      <w:proofErr w:type="spellStart"/>
+      <w:r>
+        <w:rPr>
+          <w:rFonts w:eastAsia="Times New Roman" w:cs="Arial"/>
+          <w:szCs w:val="24"/>
+          <w:lang w:eastAsia="pt-BR"/>
+        </w:rPr>
+        <w:t>Planner</w:t>
+      </w:r>
+      <w:proofErr w:type="spellEnd"/>
+      <w:r>
+        <w:rPr>
+          <w:rFonts w:eastAsia="Times New Roman" w:cs="Arial"/>
+          <w:szCs w:val="24"/>
+          <w:lang w:eastAsia="pt-BR"/>
+        </w:rPr>
+        <w:t>,</w:t>
+      </w:r>
+      <w:r>
+        <w:rPr>
+          <w:rFonts w:eastAsia="Times New Roman" w:cs="Arial"/>
+          <w:szCs w:val="24"/>
+          <w:lang w:eastAsia="pt-BR"/>
+        </w:rPr>
+        <w:t xml:space="preserve"> </w:t>
+      </w:r>
+      <w:proofErr w:type="spellStart"/>
+      <w:r>
+        <w:rPr>
+          <w:rFonts w:eastAsia="Times New Roman" w:cs="Arial"/>
+          <w:szCs w:val="24"/>
+          <w:lang w:eastAsia="pt-BR"/>
+        </w:rPr>
+        <w:t>Jira</w:t>
+      </w:r>
+      <w:proofErr w:type="spellEnd"/>
+      <w:r>
+        <w:rPr>
+          <w:rFonts w:eastAsia="Times New Roman" w:cs="Arial"/>
+          <w:szCs w:val="24"/>
+          <w:lang w:eastAsia="pt-BR"/>
+        </w:rPr>
+        <w:t xml:space="preserve"> ou GitHub </w:t>
+      </w:r>
+      <w:proofErr w:type="spellStart"/>
+      <w:r>
+        <w:rPr>
+          <w:rFonts w:eastAsia="Times New Roman" w:cs="Arial"/>
+          <w:szCs w:val="24"/>
+          <w:lang w:eastAsia="pt-BR"/>
+        </w:rPr>
+        <w:t>Projects</w:t>
+      </w:r>
+      <w:proofErr w:type="spellEnd"/>
+      <w:r>
+        <w:rPr>
+          <w:rFonts w:eastAsia="Times New Roman" w:cs="Arial"/>
+          <w:szCs w:val="24"/>
+          <w:lang w:eastAsia="pt-BR"/>
+        </w:rPr>
+        <w:t xml:space="preserve">, ou até mesmo com quadros físicos. Outro benefício importante é a melhoria na gestão do tempo, pois o </w:t>
+      </w:r>
+      <w:proofErr w:type="spellStart"/>
+      <w:r>
+        <w:rPr>
+          <w:rFonts w:eastAsia="Times New Roman" w:cs="Arial"/>
+          <w:szCs w:val="24"/>
+          <w:lang w:eastAsia="pt-BR"/>
+        </w:rPr>
+        <w:t>Kanban</w:t>
+      </w:r>
+      <w:proofErr w:type="spellEnd"/>
+      <w:r>
+        <w:rPr>
+          <w:rFonts w:eastAsia="Times New Roman" w:cs="Arial"/>
+          <w:szCs w:val="24"/>
+          <w:lang w:eastAsia="pt-BR"/>
+        </w:rPr>
+        <w:t xml:space="preserve"> permite identificar gargalos no processo e redistribuir as atividades de maneira mais eficiente. A visualização constante do progresso contribui também para uma tomada de decisão mais assertiva e um maior controle dos prazos estabelecidos. Por fim, trata-se de uma metodologia flexível, que se adapta facilmente ao ritmo de trabalho da equipe e à complexidade do projeto. Dessa forma, o uso do </w:t>
+      </w:r>
+      <w:proofErr w:type="spellStart"/>
+      <w:r>
+        <w:rPr>
+          <w:rFonts w:eastAsia="Times New Roman" w:cs="Arial"/>
+          <w:szCs w:val="24"/>
+          <w:lang w:eastAsia="pt-BR"/>
+        </w:rPr>
+        <w:t>Kanban</w:t>
+      </w:r>
+      <w:proofErr w:type="spellEnd"/>
+      <w:r>
+        <w:rPr>
+          <w:rFonts w:eastAsia="Times New Roman" w:cs="Arial"/>
+          <w:szCs w:val="24"/>
+          <w:lang w:eastAsia="pt-BR"/>
+        </w:rPr>
+        <w:t xml:space="preserve"> tem sido fundamental para garantir uma execução organizada, colaborativa e produtiva do nosso </w:t>
       </w:r>
       <w:r>
         <w:rPr>
@@ -4975,6 +5379,8 @@
         <w:pStyle w:val="Ttulo2"/>
         <w:rPr>
           <w:rFonts w:cs="Arial"/>
+          <w:b w:val="0"/>
+          <w:bCs/>
           <w:szCs w:val="24"/>
         </w:rPr>
       </w:pPr>
@@ -4982,17 +5388,12 @@
       <w:r>
         <w:rPr>
           <w:rFonts w:cs="Arial"/>
+          <w:b w:val="0"/>
+          <w:bCs/>
           <w:szCs w:val="24"/>
         </w:rPr>
         <w:lastRenderedPageBreak/>
-        <w:t>2.5</w:t>
-      </w:r>
-      <w:r>
-        <w:rPr>
-          <w:rFonts w:cs="Arial"/>
-          <w:szCs w:val="24"/>
-        </w:rPr>
-        <w:t xml:space="preserve"> Modelo de Desenvolvimento de Software/Metodologias Ágeis</w:t>
+        <w:t>2.5 Modelo de Desenvolvimento de Software/Metodologias Ágeis</w:t>
       </w:r>
       <w:bookmarkEnd w:id="49"/>
     </w:p>
@@ -5012,7 +5413,43 @@
           <w:szCs w:val="24"/>
           <w:lang w:eastAsia="pt-BR"/>
         </w:rPr>
-        <w:t>As metodologias ágeis de desenvolvimento surgiram como uma resposta à rigidez dos modelos tradicionais, buscando entregar valor de forma contínua, colaborativa e adaptável. Baseadas no Manifesto Ágil, essas metodologias priorizam a interação entre pessoas, a entrega constante de software funcional e a capacidade de responder rapidamente a mudanças nos requisitos. Entre as metodologias ágeis mais utilizadas, podemos citar o Scrum, o Kanban e o Extreme Programming (XP).</w:t>
+        <w:t xml:space="preserve">As metodologias ágeis de desenvolvimento surgiram como uma resposta à rigidez dos modelos tradicionais, buscando entregar valor de forma contínua, colaborativa e adaptável. Baseadas no Manifesto Ágil, essas metodologias priorizam a interação entre pessoas, a entrega constante de software funcional e a capacidade de responder rapidamente a mudanças nos requisitos. Entre as metodologias ágeis mais utilizadas, podemos citar o Scrum, o </w:t>
+      </w:r>
+      <w:proofErr w:type="spellStart"/>
+      <w:r>
+        <w:rPr>
+          <w:rFonts w:eastAsia="Times New Roman" w:cs="Arial"/>
+          <w:szCs w:val="24"/>
+          <w:lang w:eastAsia="pt-BR"/>
+        </w:rPr>
+        <w:t>Kanban</w:t>
+      </w:r>
+      <w:proofErr w:type="spellEnd"/>
+      <w:r>
+        <w:rPr>
+          <w:rFonts w:eastAsia="Times New Roman" w:cs="Arial"/>
+          <w:szCs w:val="24"/>
+          <w:lang w:eastAsia="pt-BR"/>
+        </w:rPr>
+        <w:t xml:space="preserve"> e o Extreme </w:t>
+      </w:r>
+      <w:proofErr w:type="spellStart"/>
+      <w:r>
+        <w:rPr>
+          <w:rFonts w:eastAsia="Times New Roman" w:cs="Arial"/>
+          <w:szCs w:val="24"/>
+          <w:lang w:eastAsia="pt-BR"/>
+        </w:rPr>
+        <w:t>Programming</w:t>
+      </w:r>
+      <w:proofErr w:type="spellEnd"/>
+      <w:r>
+        <w:rPr>
+          <w:rFonts w:eastAsia="Times New Roman" w:cs="Arial"/>
+          <w:szCs w:val="24"/>
+          <w:lang w:eastAsia="pt-BR"/>
+        </w:rPr>
+        <w:t xml:space="preserve"> (XP).</w:t>
       </w:r>
     </w:p>
     <w:p>
@@ -5039,6 +5476,8 @@
         <w:pStyle w:val="Ttulo2"/>
         <w:rPr>
           <w:rFonts w:cs="Arial"/>
+          <w:b w:val="0"/>
+          <w:bCs/>
           <w:szCs w:val="24"/>
         </w:rPr>
       </w:pPr>
@@ -5046,17 +5485,37 @@
       <w:r>
         <w:rPr>
           <w:rFonts w:cs="Arial"/>
-          <w:szCs w:val="24"/>
-        </w:rPr>
-        <w:t>2.</w:t>
-      </w:r>
-      <w:r>
-        <w:rPr>
-          <w:rFonts w:cs="Arial"/>
-          <w:szCs w:val="24"/>
-        </w:rPr>
-        <w:t>5.1</w:t>
-      </w:r>
+          <w:b w:val="0"/>
+          <w:bCs/>
+          <w:szCs w:val="24"/>
+        </w:rPr>
+        <w:t>2.5.1 SCRUM</w:t>
+      </w:r>
+      <w:bookmarkEnd w:id="50"/>
+    </w:p>
+    <w:p>
+      <w:pPr>
+        <w:rPr>
+          <w:rFonts w:cs="Arial"/>
+          <w:szCs w:val="24"/>
+        </w:rPr>
+      </w:pPr>
+      <w:r>
+        <w:rPr>
+          <w:rFonts w:cs="Arial"/>
+          <w:szCs w:val="24"/>
+        </w:rPr>
+        <w:t xml:space="preserve">Scrum é uma metodologia ágil que organiza o trabalho em ciclos curtos e repetitivos chamados sprints, normalmente com duração de duas a quatro semanas. Durante esses ciclos, a equipe trabalha de forma colaborativa para entregar partes funcionais do produto. O Scrum define papéis claros, como o </w:t>
+      </w:r>
+      <w:proofErr w:type="spellStart"/>
+      <w:r>
+        <w:rPr>
+          <w:rFonts w:cs="Arial"/>
+          <w:szCs w:val="24"/>
+        </w:rPr>
+        <w:t>Product</w:t>
+      </w:r>
+      <w:proofErr w:type="spellEnd"/>
       <w:r>
         <w:rPr>
           <w:rFonts w:cs="Arial"/>
@@ -5064,28 +5523,21 @@
         </w:rPr>
         <w:t xml:space="preserve"> </w:t>
       </w:r>
-      <w:r>
-        <w:rPr>
-          <w:rFonts w:cs="Arial"/>
-          <w:szCs w:val="24"/>
-        </w:rPr>
-        <w:t>SCRUM</w:t>
-      </w:r>
-      <w:bookmarkEnd w:id="50"/>
-    </w:p>
-    <w:p>
-      <w:pPr>
-        <w:rPr>
-          <w:rFonts w:cs="Arial"/>
-          <w:szCs w:val="24"/>
-        </w:rPr>
-      </w:pPr>
-      <w:r>
-        <w:rPr>
-          <w:rFonts w:cs="Arial"/>
-          <w:szCs w:val="24"/>
-        </w:rPr>
-        <w:t>Scrum é uma metodologia ágil que organiza o trabalho em ciclos curtos e repetitivos chamados sprints, normalmente com duração de duas a quatro semanas. Durante esses ciclos, a equipe trabalha de forma colaborativa para entregar partes funcionais do produto. O Scrum define papéis claros, como o Product Owner, o Scrum Master e o time de desenvolvimento, e promove reuniões regulares para planejamento, acompanhamento e revisão do progresso. Essa abordagem busca aumentar a transparência, a adaptabilidade e a entrega contínua de valor.</w:t>
+      <w:proofErr w:type="spellStart"/>
+      <w:r>
+        <w:rPr>
+          <w:rFonts w:cs="Arial"/>
+          <w:szCs w:val="24"/>
+        </w:rPr>
+        <w:t>Owner</w:t>
+      </w:r>
+      <w:proofErr w:type="spellEnd"/>
+      <w:r>
+        <w:rPr>
+          <w:rFonts w:cs="Arial"/>
+          <w:szCs w:val="24"/>
+        </w:rPr>
+        <w:t>, o Scrum Master e o time de desenvolvimento, e promove reuniões regulares para planejamento, acompanhamento e revisão do progresso. Essa abordagem busca aumentar a transparência, a adaptabilidade e a entrega contínua de valor.</w:t>
       </w:r>
     </w:p>
     <w:p>
@@ -5191,7 +5643,23 @@
           <w:rFonts w:cs="Arial"/>
           <w:szCs w:val="24"/>
         </w:rPr>
-        <w:t xml:space="preserve">Instituto Federal de Santa  Catarina,  2022. Disponível em:  </w:t>
+        <w:t xml:space="preserve">Instituto Federal de </w:t>
+      </w:r>
+      <w:proofErr w:type="gramStart"/>
+      <w:r>
+        <w:rPr>
+          <w:rFonts w:cs="Arial"/>
+          <w:szCs w:val="24"/>
+        </w:rPr>
+        <w:t>Santa  Catarina</w:t>
+      </w:r>
+      <w:proofErr w:type="gramEnd"/>
+      <w:r>
+        <w:rPr>
+          <w:rFonts w:cs="Arial"/>
+          <w:szCs w:val="24"/>
+        </w:rPr>
+        <w:t xml:space="preserve">,  2022. Disponível em:  </w:t>
       </w:r>
     </w:p>
     <w:p>
@@ -6542,8 +7010,18 @@
           <w:b/>
           <w:szCs w:val="24"/>
         </w:rPr>
-        <w:t>Software. Quais foram os avanços tecnológicos na educação?.</w:t>
-      </w:r>
+        <w:t xml:space="preserve">Software. Quais foram os avanços tecnológicos na </w:t>
+      </w:r>
+      <w:proofErr w:type="gramStart"/>
+      <w:r>
+        <w:rPr>
+          <w:rFonts w:cs="Arial"/>
+          <w:b/>
+          <w:szCs w:val="24"/>
+        </w:rPr>
+        <w:t>educação?.</w:t>
+      </w:r>
+      <w:proofErr w:type="gramEnd"/>
       <w:r>
         <w:rPr>
           <w:rFonts w:cs="Arial"/>
@@ -6920,13 +7398,59 @@
         </w:rPr>
         <w:t xml:space="preserve">DRUCKER, Peter. Management: </w:t>
       </w:r>
+      <w:proofErr w:type="spellStart"/>
       <w:r>
         <w:rPr>
           <w:rFonts w:cs="Arial"/>
           <w:b/>
           <w:szCs w:val="24"/>
         </w:rPr>
-        <w:t xml:space="preserve">Tasks, Responsibilities, Practices. New York: </w:t>
+        <w:t>Tasks</w:t>
+      </w:r>
+      <w:proofErr w:type="spellEnd"/>
+      <w:r>
+        <w:rPr>
+          <w:rFonts w:cs="Arial"/>
+          <w:b/>
+          <w:szCs w:val="24"/>
+        </w:rPr>
+        <w:t xml:space="preserve">, </w:t>
+      </w:r>
+      <w:proofErr w:type="spellStart"/>
+      <w:r>
+        <w:rPr>
+          <w:rFonts w:cs="Arial"/>
+          <w:b/>
+          <w:szCs w:val="24"/>
+        </w:rPr>
+        <w:t>Responsibilities</w:t>
+      </w:r>
+      <w:proofErr w:type="spellEnd"/>
+      <w:r>
+        <w:rPr>
+          <w:rFonts w:cs="Arial"/>
+          <w:b/>
+          <w:szCs w:val="24"/>
+        </w:rPr>
+        <w:t xml:space="preserve">, </w:t>
+      </w:r>
+      <w:proofErr w:type="spellStart"/>
+      <w:r>
+        <w:rPr>
+          <w:rFonts w:cs="Arial"/>
+          <w:b/>
+          <w:szCs w:val="24"/>
+        </w:rPr>
+        <w:t>Practices</w:t>
+      </w:r>
+      <w:proofErr w:type="spellEnd"/>
+      <w:r>
+        <w:rPr>
+          <w:rFonts w:cs="Arial"/>
+          <w:b/>
+          <w:szCs w:val="24"/>
+        </w:rPr>
+        <w:t xml:space="preserve">. New York: </w:t>
       </w:r>
     </w:p>
     <w:p>
@@ -7156,6 +7680,7 @@
         <w:docPartUnique/>
       </w:docPartObj>
     </w:sdtPr>
+    <w:sdtEndPr/>
     <w:sdtContent>
       <w:p>
         <w:pPr>
@@ -8671,6 +9196,7 @@
     <w:lsdException w:name="HTML Sample" w:semiHidden="1" w:unhideWhenUsed="1"/>
     <w:lsdException w:name="HTML Typewriter" w:semiHidden="1" w:unhideWhenUsed="1"/>
     <w:lsdException w:name="HTML Variable" w:semiHidden="1" w:unhideWhenUsed="1"/>
+    <w:lsdException w:name="Normal Table" w:semiHidden="1" w:unhideWhenUsed="1"/>
     <w:lsdException w:name="annotation subject" w:semiHidden="1" w:unhideWhenUsed="1"/>
     <w:lsdException w:name="No List" w:semiHidden="1" w:unhideWhenUsed="1"/>
     <w:lsdException w:name="Outline List 1" w:semiHidden="1" w:unhideWhenUsed="1"/>
@@ -8717,8 +9243,10 @@
     <w:lsdException w:name="Table Subtle 2" w:semiHidden="1" w:unhideWhenUsed="1"/>
     <w:lsdException w:name="Table Web 1" w:semiHidden="1" w:unhideWhenUsed="1"/>
     <w:lsdException w:name="Table Web 2" w:semiHidden="1" w:unhideWhenUsed="1"/>
+    <w:lsdException w:name="Table Web 3" w:semiHidden="1" w:unhideWhenUsed="1"/>
     <w:lsdException w:name="Balloon Text" w:semiHidden="1" w:unhideWhenUsed="1"/>
     <w:lsdException w:name="Table Grid" w:uiPriority="39"/>
+    <w:lsdException w:name="Table Theme" w:semiHidden="1" w:unhideWhenUsed="1"/>
     <w:lsdException w:name="Placeholder Text" w:semiHidden="1"/>
     <w:lsdException w:name="No Spacing" w:uiPriority="1" w:qFormat="1"/>
     <w:lsdException w:name="Light Shading" w:uiPriority="60"/>
@@ -9018,6 +9546,7 @@
   <w:style w:type="character" w:default="1" w:styleId="Fontepargpadro">
     <w:name w:val="Default Paragraph Font"/>
     <w:uiPriority w:val="1"/>
+    <w:semiHidden/>
     <w:unhideWhenUsed/>
   </w:style>
   <w:style w:type="table" w:default="1" w:styleId="Tabelanormal">

</xml_diff>